<commit_message>
Update with links where possible
</commit_message>
<xml_diff>
--- a/MatthewOPersico_TwoPage.docx
+++ b/MatthewOPersico_TwoPage.docx
@@ -107,40 +107,39 @@
         </w:rPr>
         <w:t xml:space="preserve"> </w:t>
       </w:r>
-      <w:r>
+      <w:hyperlink r:id="rId8" w:history="1">
+        <w:r>
+          <w:rPr>
+            <w:rStyle w:val="Hyperlink"/>
+            <w:rFonts w:ascii="Times New Roman" w:hAnsi="Times New Roman" w:cs="Times New Roman"/>
+            <w:sz w:val="21"/>
+            <w:szCs w:val="21"/>
+          </w:rPr>
+          <w:t>matthew.persico@gmail.com</w:t>
+        </w:r>
+      </w:hyperlink>
+    </w:p>
+    <w:p>
+      <w:pPr>
+        <w:spacing w:after="0" w:line="240" w:lineRule="auto"/>
+        <w:jc w:val="center"/>
         <w:rPr>
           <w:rFonts w:ascii="Times New Roman" w:hAnsi="Times New Roman" w:cs="Times New Roman"/>
           <w:sz w:val="21"/>
           <w:szCs w:val="21"/>
         </w:rPr>
-        <w:t>matthew.persico@gm</w:t>
-      </w:r>
-      <w:r>
-        <w:rPr>
-          <w:rFonts w:ascii="Times New Roman" w:hAnsi="Times New Roman" w:cs="Times New Roman"/>
-          <w:sz w:val="21"/>
-          <w:szCs w:val="21"/>
-        </w:rPr>
-        <w:t>ail</w:t>
-      </w:r>
-      <w:r>
-        <w:rPr>
-          <w:rFonts w:ascii="Times New Roman" w:hAnsi="Times New Roman" w:cs="Times New Roman"/>
-          <w:sz w:val="21"/>
-          <w:szCs w:val="21"/>
-        </w:rPr>
-        <w:t>.com</w:t>
-      </w:r>
-    </w:p>
-    <w:p>
-      <w:pPr>
-        <w:spacing w:after="0" w:line="240" w:lineRule="auto"/>
-        <w:rPr>
-          <w:rFonts w:ascii="Times New Roman" w:hAnsi="Times New Roman" w:cs="Times New Roman"/>
-          <w:sz w:val="18"/>
-          <w:szCs w:val="28"/>
-        </w:rPr>
-      </w:pPr>
+      </w:pPr>
+      <w:hyperlink r:id="rId9" w:history="1">
+        <w:r>
+          <w:rPr>
+            <w:rStyle w:val="Hyperlink"/>
+            <w:rFonts w:ascii="Times New Roman" w:hAnsi="Times New Roman" w:cs="Times New Roman"/>
+            <w:sz w:val="21"/>
+            <w:szCs w:val="21"/>
+          </w:rPr>
+          <w:t>https://www.linkedin.com/in/matthewpersico/</w:t>
+        </w:r>
+      </w:hyperlink>
     </w:p>
     <w:p>
       <w:pPr>
@@ -752,14 +751,7 @@
           <w:rFonts w:ascii="Calibri" w:hAnsi="Calibri" w:cs="Calibri"/>
           <w:szCs w:val="28"/>
         </w:rPr>
-        <w:t>Documented design and configuration for easy maintainability and onboarding for other engineers</w:t>
-      </w:r>
-      <w:r>
-        <w:rPr>
-          <w:rFonts w:ascii="Calibri" w:hAnsi="Calibri" w:cs="Calibri"/>
-          <w:szCs w:val="28"/>
-        </w:rPr>
-        <w:t xml:space="preserve"> and other Perl programs in the future.</w:t>
+        <w:t>Documented design and configuration for easy maintainability and onboarding for other engineers and other Perl programs in the future.</w:t>
       </w:r>
     </w:p>
     <w:p>
@@ -1060,21 +1052,7 @@
           <w:rFonts w:ascii="Calibri" w:hAnsi="Calibri" w:cs="Calibri"/>
           <w:szCs w:val="28"/>
         </w:rPr>
-        <w:t>BAS API Simplification</w:t>
-      </w:r>
-      <w:r>
-        <w:rPr>
-          <w:rFonts w:ascii="Calibri" w:hAnsi="Calibri" w:cs="Calibri"/>
-          <w:szCs w:val="28"/>
-        </w:rPr>
-        <w:t xml:space="preserve"> - </w:t>
-      </w:r>
-      <w:r>
-        <w:rPr>
-          <w:rFonts w:ascii="Calibri" w:hAnsi="Calibri" w:cs="Calibri"/>
-          <w:szCs w:val="28"/>
-        </w:rPr>
-        <w:t xml:space="preserve">BAS is an in-house inter-process protocol.  While reliable, there were a number of repetitive steps needed to implement a client with this protocol. </w:t>
+        <w:t xml:space="preserve">BAS API Simplification - BAS is an in-house inter-process protocol.  While reliable, there were a number of repetitive steps needed to implement a client with this protocol. </w:t>
       </w:r>
     </w:p>
     <w:p>
@@ -1490,14 +1468,7 @@
           <w:rFonts w:ascii="Calibri" w:hAnsi="Calibri" w:cs="Calibri"/>
           <w:szCs w:val="28"/>
         </w:rPr>
-        <w:t>Universal Automation Center (UAC) from Stonebranch</w:t>
-      </w:r>
-      <w:r>
-        <w:rPr>
-          <w:rFonts w:ascii="Calibri" w:hAnsi="Calibri" w:cs="Calibri"/>
-          <w:szCs w:val="28"/>
-        </w:rPr>
-        <w:t xml:space="preserve"> </w:t>
+        <w:t xml:space="preserve">Universal Automation Center (UAC) from Stonebranch </w:t>
       </w:r>
       <w:r>
         <w:rPr>
@@ -2015,15 +1986,6 @@
           <w:sz w:val="24"/>
           <w:szCs w:val="28"/>
         </w:rPr>
-        <w:t xml:space="preserve"> Name</w:t>
-      </w:r>
-      <w:r>
-        <w:rPr>
-          <w:rFonts w:ascii="Calibri" w:hAnsi="Calibri" w:cs="Calibri"/>
-          <w:b/>
-          <w:sz w:val="24"/>
-          <w:szCs w:val="28"/>
-        </w:rPr>
         <w:t xml:space="preserve">, </w:t>
       </w:r>
       <w:r>
@@ -2066,73 +2028,76 @@
           <w:szCs w:val="28"/>
         </w:rPr>
       </w:pPr>
-      <w:r>
+      <w:hyperlink r:id="rId10" w:history="1">
+        <w:r>
+          <w:rPr>
+            <w:rStyle w:val="Hyperlink"/>
+            <w:rFonts w:ascii="Calibri" w:hAnsi="Calibri" w:cs="Calibri"/>
+            <w:bCs/>
+            <w:sz w:val="24"/>
+            <w:szCs w:val="28"/>
+          </w:rPr>
+          <w:t>https://jacobfilipp.com/DrDobbs/articles/TPJ/2003/0301/0301a/0301a.htm</w:t>
+        </w:r>
+      </w:hyperlink>
+    </w:p>
+    <w:p>
+      <w:pPr>
+        <w:spacing w:after="0" w:line="240" w:lineRule="auto"/>
         <w:rPr>
           <w:rFonts w:ascii="Calibri" w:hAnsi="Calibri" w:cs="Calibri"/>
           <w:bCs/>
           <w:sz w:val="24"/>
           <w:szCs w:val="28"/>
         </w:rPr>
-        <w:t>https://jacobfilipp.com/DrDobbs/articles/TPJ/2003/0301/0301a/0301a.htm</w:t>
-      </w:r>
-    </w:p>
-    <w:p>
-      <w:pPr>
-        <w:spacing w:after="0" w:line="240" w:lineRule="auto"/>
+      </w:pPr>
+      <w:r>
         <w:rPr>
           <w:rFonts w:ascii="Calibri" w:hAnsi="Calibri" w:cs="Calibri"/>
           <w:bCs/>
           <w:sz w:val="24"/>
           <w:szCs w:val="28"/>
         </w:rPr>
-      </w:pPr>
-      <w:r>
+        <w:t xml:space="preserve">  </w:t>
+      </w:r>
+    </w:p>
+    <w:p>
+      <w:pPr>
+        <w:spacing w:after="0" w:line="240" w:lineRule="auto"/>
+        <w:rPr>
+          <w:rFonts w:ascii="Calibri" w:hAnsi="Calibri" w:cs="Calibri"/>
+          <w:b/>
+          <w:sz w:val="24"/>
+          <w:szCs w:val="28"/>
+        </w:rPr>
+      </w:pPr>
+      <w:r>
+        <w:rPr>
+          <w:rFonts w:ascii="Calibri" w:hAnsi="Calibri" w:cs="Calibri"/>
+          <w:b/>
+          <w:sz w:val="24"/>
+          <w:szCs w:val="28"/>
+        </w:rPr>
+        <w:t>Finance::Performance::Calc</w:t>
+      </w:r>
+    </w:p>
+    <w:p>
+      <w:pPr>
+        <w:spacing w:after="0" w:line="240" w:lineRule="auto"/>
         <w:rPr>
           <w:rFonts w:ascii="Calibri" w:hAnsi="Calibri" w:cs="Calibri"/>
           <w:bCs/>
           <w:sz w:val="24"/>
           <w:szCs w:val="28"/>
         </w:rPr>
-        <w:t xml:space="preserve">  </w:t>
-      </w:r>
-    </w:p>
-    <w:p>
-      <w:pPr>
-        <w:spacing w:after="0" w:line="240" w:lineRule="auto"/>
-        <w:rPr>
-          <w:rFonts w:ascii="Calibri" w:hAnsi="Calibri" w:cs="Calibri"/>
-          <w:b/>
-          <w:sz w:val="24"/>
-          <w:szCs w:val="28"/>
-        </w:rPr>
-      </w:pPr>
-      <w:r>
-        <w:rPr>
-          <w:rFonts w:ascii="Calibri" w:hAnsi="Calibri" w:cs="Calibri"/>
-          <w:b/>
-          <w:sz w:val="24"/>
-          <w:szCs w:val="28"/>
-        </w:rPr>
-        <w:t>Finance::Performance::Calc</w:t>
-      </w:r>
-    </w:p>
-    <w:p>
-      <w:pPr>
-        <w:spacing w:after="0" w:line="240" w:lineRule="auto"/>
+      </w:pPr>
+      <w:r>
         <w:rPr>
           <w:rFonts w:ascii="Calibri" w:hAnsi="Calibri" w:cs="Calibri"/>
           <w:bCs/>
           <w:sz w:val="24"/>
           <w:szCs w:val="28"/>
         </w:rPr>
-      </w:pPr>
-      <w:r>
-        <w:rPr>
-          <w:rFonts w:ascii="Calibri" w:hAnsi="Calibri" w:cs="Calibri"/>
-          <w:bCs/>
-          <w:sz w:val="24"/>
-          <w:szCs w:val="28"/>
-        </w:rPr>
         <w:t>Perl extension to calculate linked performance numbers.</w:t>
       </w:r>
     </w:p>
@@ -2146,15 +2111,18 @@
           <w:szCs w:val="28"/>
         </w:rPr>
       </w:pPr>
-      <w:r>
-        <w:rPr>
-          <w:rFonts w:ascii="Calibri" w:hAnsi="Calibri" w:cs="Calibri"/>
-          <w:bCs/>
-          <w:sz w:val="24"/>
-          <w:szCs w:val="28"/>
-        </w:rPr>
-        <w:t>http://search.cpan.org/~persicom/Finance-Performance-Calc-1.January lib/Finance/Performance/Calc.</w:t>
-      </w:r>
+      <w:hyperlink r:id="rId11" w:history="1">
+        <w:r>
+          <w:rPr>
+            <w:rStyle w:val="Hyperlink"/>
+            <w:rFonts w:ascii="Calibri" w:hAnsi="Calibri" w:cs="Calibri"/>
+            <w:bCs/>
+            <w:sz w:val="24"/>
+            <w:szCs w:val="28"/>
+          </w:rPr>
+          <w:t>http://search.cpan.org/~persicom/Finance-Performance-Calc-1.January lib/Finance/Performance/Calc</w:t>
+        </w:r>
+      </w:hyperlink>
     </w:p>
     <w:sectPr>
       <w:pgSz w:w="12240" w:h="15840"/>
@@ -2955,6 +2923,29 @@
     <w:uiPriority w:val="99"/>
     <w:rsid w:val="00664D16"/>
   </w:style>
+  <w:style w:type="character" w:styleId="Hyperlink">
+    <w:name w:val="Hyperlink"/>
+    <w:basedOn w:val="DefaultParagraphFont"/>
+    <w:uiPriority w:val="99"/>
+    <w:unhideWhenUsed/>
+    <w:rsid w:val="00A627A0"/>
+    <w:rPr>
+      <w:color w:val="0563C1" w:themeColor="hyperlink"/>
+      <w:u w:val="single"/>
+    </w:rPr>
+  </w:style>
+  <w:style w:type="character" w:styleId="UnresolvedMention">
+    <w:name w:val="Unresolved Mention"/>
+    <w:basedOn w:val="DefaultParagraphFont"/>
+    <w:uiPriority w:val="99"/>
+    <w:semiHidden/>
+    <w:unhideWhenUsed/>
+    <w:rsid w:val="00A627A0"/>
+    <w:rPr>
+      <w:color w:val="605E5C"/>
+      <w:shd w:val="clear" w:color="auto" w:fill="E1DFDD"/>
+    </w:rPr>
+  </w:style>
 </w:styles>
 </file>
 

</xml_diff>